<commit_message>
Actualització documents benvinguda 26-27
</commit_message>
<xml_diff>
--- a/docs/PlantillaPlaDocent.docx
+++ b/docs/PlantillaPlaDocent.docx
@@ -248,8 +248,6 @@
               <w:spacing w:before="0" w:beforeAutospacing="off" w:after="0" w:afterAutospacing="off" w:line="279" w:lineRule="auto"/>
               <w:ind w:left="0" w:right="0"/>
               <w:jc w:val="left"/>
-            </w:pPr>
-            <w:r>
               <w:rPr>
                 <w:rFonts w:ascii="Arial" w:hAnsi="Arial" w:eastAsia="Arial" w:cs="Arial"/>
                 <w:b w:val="0"/>
@@ -261,8 +259,7 @@
                 <w:szCs w:val="22"/>
                 <w:lang w:val="ca-ES"/>
               </w:rPr>
-              <w:t>Teoria de la publicitat i el màrqueting</w:t>
-            </w:r>
+            </w:pPr>
           </w:p>
         </w:tc>
       </w:tr>
@@ -339,8 +336,6 @@
               <w:spacing w:before="0" w:beforeAutospacing="off" w:after="0" w:afterAutospacing="off" w:line="259" w:lineRule="auto"/>
               <w:ind w:left="0" w:right="0"/>
               <w:jc w:val="left"/>
-            </w:pPr>
-            <w:r>
               <w:rPr>
                 <w:rFonts w:ascii="Arial" w:hAnsi="Arial" w:eastAsia="Arial" w:cs="Arial"/>
                 <w:b w:val="0"/>
@@ -352,8 +347,7 @@
                 <w:szCs w:val="22"/>
                 <w:lang w:val="ca-ES"/>
               </w:rPr>
-              <w:t>Andrea Xandri</w:t>
-            </w:r>
+            </w:pPr>
           </w:p>
         </w:tc>
       </w:tr>
@@ -451,32 +445,6 @@
                 <w:lang w:val="ca-ES"/>
               </w:rPr>
             </w:pPr>
-            <w:r>
-              <w:rPr>
-                <w:rFonts w:ascii="Arial" w:hAnsi="Arial" w:eastAsia="Arial" w:cs="Arial"/>
-                <w:b w:val="0"/>
-                <w:bCs w:val="0"/>
-                <w:i w:val="1"/>
-                <w:iCs w:val="1"/>
-                <w:sz w:val="22"/>
-                <w:szCs w:val="22"/>
-                <w:lang w:val="ca-ES"/>
-              </w:rPr>
-              <w:t>Andrea.xandri</w:t>
-            </w:r>
-            <w:r>
-              <w:rPr>
-                <w:rFonts w:ascii="Arial" w:hAnsi="Arial" w:eastAsia="Arial" w:cs="Arial"/>
-                <w:b w:val="0"/>
-                <w:bCs w:val="0"/>
-                <w:i w:val="1"/>
-                <w:iCs w:val="1"/>
-                <w:sz w:val="22"/>
-                <w:szCs w:val="22"/>
-                <w:lang w:val="ca-ES"/>
-              </w:rPr>
-              <w:t>@fundaciocic.org</w:t>
-            </w:r>
           </w:p>
         </w:tc>
       </w:tr>
@@ -550,8 +518,6 @@
               <w:spacing w:before="0" w:beforeAutospacing="off" w:after="0" w:afterAutospacing="off" w:line="240" w:lineRule="auto"/>
               <w:ind w:left="0" w:right="0"/>
               <w:jc w:val="left"/>
-            </w:pPr>
-            <w:r>
               <w:rPr>
                 <w:rFonts w:ascii="Arial" w:hAnsi="Arial" w:eastAsia="Arial" w:cs="Arial"/>
                 <w:b w:val="0"/>
@@ -563,8 +529,7 @@
                 <w:szCs w:val="22"/>
                 <w:lang w:val="ca-ES"/>
               </w:rPr>
-              <w:t>99h</w:t>
-            </w:r>
+            </w:pPr>
           </w:p>
         </w:tc>
       </w:tr>
@@ -755,104 +720,6 @@
           </w:tcPr>
           <w:p>
             <w:pPr>
-              <w:pStyle w:val="Normal"/>
-              <w:spacing w:before="0" w:beforeAutospacing="off" w:after="0" w:afterAutospacing="off"/>
-              <w:jc w:val="left"/>
-              <w:rPr>
-                <w:rFonts w:ascii="ArialMT" w:hAnsi="ArialMT" w:eastAsia="ArialMT" w:cs="ArialMT"/>
-                <w:noProof w:val="0"/>
-                <w:sz w:val="22"/>
-                <w:szCs w:val="22"/>
-                <w:lang w:val="ca-ES"/>
-              </w:rPr>
-            </w:pPr>
-          </w:p>
-          <w:p>
-            <w:pPr>
-              <w:pStyle w:val="Normal"/>
-              <w:spacing w:before="0" w:beforeAutospacing="off" w:after="0" w:afterAutospacing="off"/>
-              <w:jc w:val="left"/>
-              <w:rPr>
-                <w:rFonts w:ascii="ArialMT" w:hAnsi="ArialMT" w:eastAsia="ArialMT" w:cs="ArialMT"/>
-                <w:noProof w:val="0"/>
-                <w:sz w:val="22"/>
-                <w:szCs w:val="22"/>
-                <w:lang w:val="ca-ES"/>
-              </w:rPr>
-            </w:pPr>
-            <w:r>
-              <w:rPr>
-                <w:rFonts w:ascii="ArialMT" w:hAnsi="ArialMT" w:eastAsia="ArialMT" w:cs="ArialMT"/>
-                <w:noProof w:val="0"/>
-                <w:sz w:val="22"/>
-                <w:szCs w:val="22"/>
-                <w:lang w:val="ca-ES"/>
-              </w:rPr>
-              <w:t xml:space="preserve">UF1 - </w:t>
-            </w:r>
-            <w:r>
-              <w:rPr>
-                <w:rFonts w:ascii="ArialMT" w:hAnsi="ArialMT" w:eastAsia="ArialMT" w:cs="ArialMT"/>
-                <w:noProof w:val="0"/>
-                <w:sz w:val="22"/>
-                <w:szCs w:val="22"/>
-                <w:lang w:val="ca-ES"/>
-              </w:rPr>
-              <w:t>Màrqueting</w:t>
-            </w:r>
-            <w:r>
-              <w:rPr>
-                <w:rFonts w:ascii="ArialMT" w:hAnsi="ArialMT" w:eastAsia="ArialMT" w:cs="ArialMT"/>
-                <w:noProof w:val="0"/>
-                <w:sz w:val="22"/>
-                <w:szCs w:val="22"/>
-                <w:lang w:val="ca-ES"/>
-              </w:rPr>
-              <w:t xml:space="preserve">. </w:t>
-            </w:r>
-            <w:r>
-              <w:rPr>
-                <w:rFonts w:ascii="ArialMT" w:hAnsi="ArialMT" w:eastAsia="ArialMT" w:cs="ArialMT"/>
-                <w:noProof w:val="0"/>
-                <w:sz w:val="22"/>
-                <w:szCs w:val="22"/>
-                <w:lang w:val="ca-ES"/>
-              </w:rPr>
-              <w:t>Estratègia</w:t>
-            </w:r>
-            <w:r>
-              <w:rPr>
-                <w:rFonts w:ascii="ArialMT" w:hAnsi="ArialMT" w:eastAsia="ArialMT" w:cs="ArialMT"/>
-                <w:noProof w:val="0"/>
-                <w:sz w:val="22"/>
-                <w:szCs w:val="22"/>
-                <w:lang w:val="ca-ES"/>
-              </w:rPr>
-              <w:t xml:space="preserve"> i </w:t>
-            </w:r>
-            <w:r>
-              <w:rPr>
-                <w:rFonts w:ascii="ArialMT" w:hAnsi="ArialMT" w:eastAsia="ArialMT" w:cs="ArialMT"/>
-                <w:noProof w:val="0"/>
-                <w:sz w:val="22"/>
-                <w:szCs w:val="22"/>
-                <w:lang w:val="ca-ES"/>
-              </w:rPr>
-              <w:t>planificacio</w:t>
-            </w:r>
-            <w:r>
-              <w:rPr>
-                <w:rFonts w:ascii="ArialMT" w:hAnsi="ArialMT" w:eastAsia="ArialMT" w:cs="ArialMT"/>
-                <w:noProof w:val="0"/>
-                <w:sz w:val="22"/>
-                <w:szCs w:val="22"/>
-                <w:lang w:val="ca-ES"/>
-              </w:rPr>
-              <w:t xml:space="preserve">́ </w:t>
-            </w:r>
-          </w:p>
-          <w:p>
-            <w:pPr>
               <w:spacing w:before="0" w:beforeAutospacing="off" w:after="0" w:afterAutospacing="off"/>
               <w:jc w:val="left"/>
             </w:pPr>
@@ -888,20 +755,6 @@
                 <w:lang w:val="ca-ES"/>
               </w:rPr>
             </w:pPr>
-            <w:r>
-              <w:rPr>
-                <w:rFonts w:ascii="Arial" w:hAnsi="Arial" w:eastAsia="Arial" w:cs="Arial"/>
-                <w:b w:val="0"/>
-                <w:bCs w:val="0"/>
-                <w:i w:val="1"/>
-                <w:iCs w:val="1"/>
-                <w:color w:val="000000" w:themeColor="text1" w:themeTint="FF" w:themeShade="FF"/>
-                <w:sz w:val="20"/>
-                <w:szCs w:val="20"/>
-                <w:lang w:val="ca-ES"/>
-              </w:rPr>
-              <w:t>33</w:t>
-            </w:r>
           </w:p>
         </w:tc>
       </w:tr>
@@ -924,48 +777,6 @@
             </w:tcMar>
             <w:vAlign w:val="center"/>
           </w:tcPr>
-          <w:p>
-            <w:pPr>
-              <w:spacing w:before="0" w:beforeAutospacing="off" w:after="0" w:afterAutospacing="off"/>
-              <w:jc w:val="left"/>
-            </w:pPr>
-          </w:p>
-          <w:p>
-            <w:pPr>
-              <w:spacing w:before="0" w:beforeAutospacing="off" w:after="0" w:afterAutospacing="off"/>
-              <w:jc w:val="left"/>
-            </w:pPr>
-            <w:r>
-              <w:rPr>
-                <w:rFonts w:ascii="ArialMT" w:hAnsi="ArialMT" w:eastAsia="ArialMT" w:cs="ArialMT"/>
-                <w:noProof w:val="0"/>
-                <w:sz w:val="22"/>
-                <w:szCs w:val="22"/>
-                <w:lang w:val="ca-ES"/>
-              </w:rPr>
-              <w:t xml:space="preserve">UF2 - Publicitat. </w:t>
-            </w:r>
-            <w:r>
-              <w:rPr>
-                <w:rFonts w:ascii="ArialMT" w:hAnsi="ArialMT" w:eastAsia="ArialMT" w:cs="ArialMT"/>
-                <w:noProof w:val="0"/>
-                <w:sz w:val="22"/>
-                <w:szCs w:val="22"/>
-                <w:lang w:val="ca-ES"/>
-              </w:rPr>
-              <w:t>Comercialitzacio</w:t>
-            </w:r>
-            <w:r>
-              <w:rPr>
-                <w:rFonts w:ascii="ArialMT" w:hAnsi="ArialMT" w:eastAsia="ArialMT" w:cs="ArialMT"/>
-                <w:noProof w:val="0"/>
-                <w:sz w:val="22"/>
-                <w:szCs w:val="22"/>
-                <w:lang w:val="ca-ES"/>
-              </w:rPr>
-              <w:t xml:space="preserve">́ i disseny </w:t>
-            </w:r>
-          </w:p>
           <w:p>
             <w:pPr>
               <w:pStyle w:val="Normal"/>
@@ -1007,8 +818,6 @@
               <w:spacing w:before="0" w:beforeAutospacing="off" w:after="0" w:afterAutospacing="off" w:line="240" w:lineRule="auto"/>
               <w:ind w:left="0" w:right="0"/>
               <w:jc w:val="left"/>
-            </w:pPr>
-            <w:r>
               <w:rPr>
                 <w:rFonts w:ascii="Arial" w:hAnsi="Arial" w:eastAsia="Arial" w:cs="Arial"/>
                 <w:b w:val="0"/>
@@ -1020,8 +829,7 @@
                 <w:szCs w:val="20"/>
                 <w:lang w:val="ca-ES"/>
               </w:rPr>
-              <w:t>33</w:t>
-            </w:r>
+            </w:pPr>
           </w:p>
         </w:tc>
       </w:tr>
@@ -1044,48 +852,6 @@
             </w:tcMar>
             <w:vAlign w:val="center"/>
           </w:tcPr>
-          <w:p>
-            <w:pPr>
-              <w:spacing w:before="0" w:beforeAutospacing="off" w:after="0" w:afterAutospacing="off"/>
-              <w:jc w:val="left"/>
-            </w:pPr>
-          </w:p>
-          <w:p>
-            <w:pPr>
-              <w:spacing w:before="0" w:beforeAutospacing="off" w:after="0" w:afterAutospacing="off"/>
-              <w:jc w:val="left"/>
-            </w:pPr>
-            <w:r>
-              <w:rPr>
-                <w:rFonts w:ascii="ArialMT" w:hAnsi="ArialMT" w:eastAsia="ArialMT" w:cs="ArialMT"/>
-                <w:noProof w:val="0"/>
-                <w:sz w:val="22"/>
-                <w:szCs w:val="22"/>
-                <w:lang w:val="ca-ES"/>
-              </w:rPr>
-              <w:t xml:space="preserve">UF3 - Publicitat i </w:t>
-            </w:r>
-            <w:r>
-              <w:rPr>
-                <w:rFonts w:ascii="ArialMT" w:hAnsi="ArialMT" w:eastAsia="ArialMT" w:cs="ArialMT"/>
-                <w:noProof w:val="0"/>
-                <w:sz w:val="22"/>
-                <w:szCs w:val="22"/>
-                <w:lang w:val="ca-ES"/>
-              </w:rPr>
-              <w:t>màrqueting</w:t>
-            </w:r>
-            <w:r>
-              <w:rPr>
-                <w:rFonts w:ascii="ArialMT" w:hAnsi="ArialMT" w:eastAsia="ArialMT" w:cs="ArialMT"/>
-                <w:noProof w:val="0"/>
-                <w:sz w:val="22"/>
-                <w:szCs w:val="22"/>
-                <w:lang w:val="ca-ES"/>
-              </w:rPr>
-              <w:t xml:space="preserve"> digital </w:t>
-            </w:r>
-          </w:p>
           <w:p>
             <w:pPr>
               <w:jc w:val="left"/>
@@ -1126,8 +892,6 @@
               <w:spacing w:before="0" w:beforeAutospacing="off" w:after="0" w:afterAutospacing="off" w:line="240" w:lineRule="auto"/>
               <w:ind w:left="0" w:right="0"/>
               <w:jc w:val="left"/>
-            </w:pPr>
-            <w:r>
               <w:rPr>
                 <w:rFonts w:ascii="Arial" w:hAnsi="Arial" w:eastAsia="Arial" w:cs="Arial"/>
                 <w:b w:val="0"/>
@@ -1139,8 +903,7 @@
                 <w:szCs w:val="20"/>
                 <w:lang w:val="ca-ES"/>
               </w:rPr>
-              <w:t>33</w:t>
-            </w:r>
+            </w:pPr>
           </w:p>
         </w:tc>
       </w:tr>
@@ -1232,20 +995,6 @@
                 <w:lang w:val="ca-ES"/>
               </w:rPr>
               <w:t xml:space="preserve">Elaborat: </w:t>
-            </w:r>
-            <w:r>
-              <w:rPr>
-                <w:rFonts w:ascii="Aptos" w:hAnsi="Aptos" w:eastAsia="Aptos" w:cs="" w:asciiTheme="minorAscii" w:hAnsiTheme="minorAscii" w:eastAsiaTheme="minorAscii" w:cstheme="minorBidi"/>
-                <w:b w:val="0"/>
-                <w:bCs w:val="0"/>
-                <w:i w:val="1"/>
-                <w:iCs w:val="1"/>
-                <w:color w:val="0F9DD4"/>
-                <w:sz w:val="20"/>
-                <w:szCs w:val="20"/>
-                <w:lang w:val="ca-ES" w:eastAsia="en-US" w:bidi="ar-SA"/>
-              </w:rPr>
-              <w:t>Andrea Xandri</w:t>
             </w:r>
           </w:p>
         </w:tc>
@@ -5236,8 +4985,8 @@
 </file>
 
 <file path=customXml/item1.xml><?xml version="1.0" encoding="utf-8"?>
-<ct:contentTypeSchema xmlns:ct="http://schemas.microsoft.com/office/2006/metadata/contentType" xmlns:ma="http://schemas.microsoft.com/office/2006/metadata/properties/metaAttributes" ct:_="" ma:_="" ma:contentTypeName="Document" ma:contentTypeID="0x01010088C3D28085A80A4A9D14D92435298F98" ma:contentTypeVersion="13" ma:contentTypeDescription="Crea un document nou" ma:contentTypeScope="" ma:versionID="92dbbac49ebbb556c004a9d1357f1ccd">
-  <xsd:schema xmlns:xsd="http://www.w3.org/2001/XMLSchema" xmlns:xs="http://www.w3.org/2001/XMLSchema" xmlns:p="http://schemas.microsoft.com/office/2006/metadata/properties" xmlns:ns2="5b24c473-9434-4082-91cd-3580f029d14b" xmlns:ns3="db9ae388-4188-4881-9197-1b7e8d04eeab" targetNamespace="http://schemas.microsoft.com/office/2006/metadata/properties" ma:root="true" ma:fieldsID="6a8ea1b45343ee6de0aaba35d485825b" ns2:_="" ns3:_="">
+<ct:contentTypeSchema xmlns:ct="http://schemas.microsoft.com/office/2006/metadata/contentType" xmlns:ma="http://schemas.microsoft.com/office/2006/metadata/properties/metaAttributes" ct:_="" ma:_="" ma:contentTypeName="Documento" ma:contentTypeID="0x01010088C3D28085A80A4A9D14D92435298F98" ma:contentTypeVersion="13" ma:contentTypeDescription="Crear nuevo documento." ma:contentTypeScope="" ma:versionID="8956e1b1197eacce3b2b5434279f4b7a">
+  <xsd:schema xmlns:xsd="http://www.w3.org/2001/XMLSchema" xmlns:xs="http://www.w3.org/2001/XMLSchema" xmlns:p="http://schemas.microsoft.com/office/2006/metadata/properties" xmlns:ns2="5b24c473-9434-4082-91cd-3580f029d14b" xmlns:ns3="db9ae388-4188-4881-9197-1b7e8d04eeab" targetNamespace="http://schemas.microsoft.com/office/2006/metadata/properties" ma:root="true" ma:fieldsID="504a6e0329bef5d76fb965572f5deb22" ns2:_="" ns3:_="">
     <xsd:import namespace="5b24c473-9434-4082-91cd-3580f029d14b"/>
     <xsd:import namespace="db9ae388-4188-4881-9197-1b7e8d04eeab"/>
     <xsd:element name="properties">
@@ -5308,7 +5057,7 @@
         <xsd:restriction base="dms:Unknown"/>
       </xsd:simpleType>
     </xsd:element>
-    <xsd:element name="lcf76f155ced4ddcb4097134ff3c332f" ma:index="17" nillable="true" ma:taxonomy="true" ma:internalName="lcf76f155ced4ddcb4097134ff3c332f" ma:taxonomyFieldName="MediaServiceImageTags" ma:displayName="Etiquetes de la imatge" ma:readOnly="false" ma:fieldId="{5cf76f15-5ced-4ddc-b409-7134ff3c332f}" ma:taxonomyMulti="true" ma:sspId="8d2c37b5-5c84-4ae5-8b47-30976ebef1ed" ma:termSetId="09814cd3-568e-fe90-9814-8d621ff8fb84" ma:anchorId="fba54fb3-c3e1-fe81-a776-ca4b69148c4d" ma:open="true" ma:isKeyword="false">
+    <xsd:element name="lcf76f155ced4ddcb4097134ff3c332f" ma:index="17" nillable="true" ma:taxonomy="true" ma:internalName="lcf76f155ced4ddcb4097134ff3c332f" ma:taxonomyFieldName="MediaServiceImageTags" ma:displayName="Etiquetas de imagen" ma:readOnly="false" ma:fieldId="{5cf76f15-5ced-4ddc-b409-7134ff3c332f}" ma:taxonomyMulti="true" ma:sspId="8d2c37b5-5c84-4ae5-8b47-30976ebef1ed" ma:termSetId="09814cd3-568e-fe90-9814-8d621ff8fb84" ma:anchorId="fba54fb3-c3e1-fe81-a776-ca4b69148c4d" ma:open="true" ma:isKeyword="false">
       <xsd:complexType>
         <xsd:sequence>
           <xsd:element ref="pc:Terms" minOccurs="0" maxOccurs="1"/>
@@ -5352,8 +5101,8 @@
         <xsd:element ref="dc:creator" minOccurs="0" maxOccurs="1"/>
         <xsd:element ref="dcterms:created" minOccurs="0" maxOccurs="1"/>
         <xsd:element ref="dc:identifier" minOccurs="0" maxOccurs="1"/>
-        <xsd:element name="contentType" minOccurs="0" maxOccurs="1" type="xsd:string" ma:index="0" ma:displayName="Tipus de contingut"/>
-        <xsd:element ref="dc:title" minOccurs="0" maxOccurs="1" ma:index="4" ma:displayName="Títol"/>
+        <xsd:element name="contentType" minOccurs="0" maxOccurs="1" type="xsd:string" ma:index="0" ma:displayName="Tipo de contenido"/>
+        <xsd:element ref="dc:title" minOccurs="0" maxOccurs="1" ma:index="4" ma:displayName="Título"/>
         <xsd:element ref="dc:subject" minOccurs="0" maxOccurs="1"/>
         <xsd:element ref="dc:description" minOccurs="0" maxOccurs="1"/>
         <xsd:element name="keywords" minOccurs="0" maxOccurs="1" type="xsd:string"/>
@@ -5463,7 +5212,7 @@
 </file>
 
 <file path=customXml/itemProps1.xml><?xml version="1.0" encoding="utf-8"?>
-<ds:datastoreItem xmlns:ds="http://schemas.openxmlformats.org/officeDocument/2006/customXml" ds:itemID="{F1B8946F-6942-4786-A473-77FB368AC25E}"/>
+<ds:datastoreItem xmlns:ds="http://schemas.openxmlformats.org/officeDocument/2006/customXml" ds:itemID="{7179E21B-1204-4FCE-B85E-AFE78D308BD7}"/>
 </file>
 
 <file path=customXml/itemProps2.xml><?xml version="1.0" encoding="utf-8"?>

</xml_diff>